<commit_message>
Challenge marks one enemy, not the whole field
Single target within 30 feet until the start of Sandshrew's next turn.
The handler now picks who gets shut down, usually whoever slipped past
the wall to go after Lilly or Ursa, instead of blanketing every enemy in
sight (DM call).

Co-Authored-By: Claude Opus 4.8 <noreply@anthropic.com>
</commit_message>
<xml_diff>
--- a/characters/sandshrew_statblock.docx
+++ b/characters/sandshrew_statblock.docx
@@ -644,7 +644,7 @@
                 <w:color w:val="222222"/>
                 <w:sz w:val="17"/>
               </w:rPr>
-              <w:t>Bonus Action.</w:t>
+              <w:t>Bonus Action, 30 ft., one enemy that can see it.</w:t>
             </w:r>
             <w:r>
               <w:rPr>
@@ -654,7 +654,7 @@
                 <w:color w:val="222222"/>
                 <w:sz w:val="17"/>
               </w:rPr>
-              <w:t xml:space="preserve"> Sandshrew rears up with a rattling hiss and dares them to try it. Until the start of its next turn, each enemy within 30 feet that can see it has Disadvantage on attack rolls against any target other than Sandshrew.</w:t>
+              <w:t xml:space="preserve"> Sandshrew rears up with a rattling hiss and dares that one to try it. Until the start of Sandshrew's next turn, the target has Disadvantage on attack rolls against any target other than Sandshrew.</w:t>
             </w:r>
           </w:p>
           <w:p>

</xml_diff>